<commit_message>
Finalize report and document AI usage
</commit_message>
<xml_diff>
--- a/assignment1-report.docx
+++ b/assignment1-report.docx
@@ -27,7 +27,37 @@
       <w:pPr>
         <w:spacing w:after="80" w:line="240" w:lineRule="auto"/>
         <w:rPr>
-          <w:rFonts w:hint="eastAsia"/>
+          <w:sz w:val="22"/>
+          <w:szCs w:val="22"/>
+        </w:rPr>
+      </w:pPr>
+      <w:r>
+        <w:rPr>
+          <w:sz w:val="22"/>
+          <w:szCs w:val="22"/>
+        </w:rPr>
+        <w:t>GitHub Repository:</w:t>
+      </w:r>
+      <w:r>
+        <w:rPr>
+          <w:rFonts w:hint="eastAsia"/>
+          <w:sz w:val="22"/>
+          <w:szCs w:val="22"/>
+        </w:rPr>
+        <w:t xml:space="preserve"> </w:t>
+      </w:r>
+      <w:r>
+        <w:rPr>
+          <w:sz w:val="22"/>
+          <w:szCs w:val="22"/>
+        </w:rPr>
+        <w:t>https://github.com/Zixin-Y/cs6650-assignment1</w:t>
+      </w:r>
+    </w:p>
+    <w:p>
+      <w:pPr>
+        <w:spacing w:after="80" w:line="240" w:lineRule="auto"/>
+        <w:rPr>
           <w:sz w:val="22"/>
           <w:szCs w:val="22"/>
         </w:rPr>
@@ -64,7 +94,6 @@
       <w:pPr>
         <w:spacing w:after="80" w:line="240" w:lineRule="auto"/>
         <w:rPr>
-          <w:rFonts w:hint="eastAsia"/>
           <w:sz w:val="22"/>
           <w:szCs w:val="22"/>
         </w:rPr>
@@ -1140,6 +1169,7 @@
           <w:sz w:val="22"/>
           <w:szCs w:val="22"/>
         </w:rPr>
+        <w:lastRenderedPageBreak/>
         <w:t>SwipeCsvRecorder</w:t>
       </w:r>
       <w:proofErr w:type="spellEnd"/>
@@ -1194,7 +1224,6 @@
           <w:sz w:val="22"/>
           <w:szCs w:val="22"/>
         </w:rPr>
-        <w:lastRenderedPageBreak/>
         <w:t xml:space="preserve">HTTP durations use </w:t>
       </w:r>
       <w:proofErr w:type="spellStart"/>
@@ -1320,7 +1349,6 @@
       <w:pPr>
         <w:spacing w:after="80" w:line="240" w:lineRule="auto"/>
         <w:rPr>
-          <w:rFonts w:hint="eastAsia"/>
           <w:sz w:val="22"/>
           <w:szCs w:val="22"/>
         </w:rPr>
@@ -1422,7 +1450,6 @@
       <w:pPr>
         <w:spacing w:after="80" w:line="240" w:lineRule="auto"/>
         <w:rPr>
-          <w:rFonts w:hint="eastAsia"/>
           <w:b/>
           <w:bCs/>
           <w:sz w:val="22"/>
@@ -1525,7 +1552,6 @@
       <w:pPr>
         <w:spacing w:after="80" w:line="240" w:lineRule="auto"/>
         <w:rPr>
-          <w:rFonts w:hint="eastAsia"/>
           <w:sz w:val="22"/>
           <w:szCs w:val="22"/>
         </w:rPr>
@@ -1616,7 +1642,6 @@
     <w:p>
       <w:pPr>
         <w:rPr>
-          <w:rFonts w:hint="eastAsia"/>
           <w:b/>
           <w:bCs/>
         </w:rPr>
@@ -1645,7 +1670,7 @@
           <w:szCs w:val="22"/>
         </w:rPr>
         <w:drawing>
-          <wp:inline distT="0" distB="0" distL="0" distR="0" wp14:anchorId="67059FEB" wp14:editId="7868B3B4">
+          <wp:inline distT="0" distB="0" distL="0" distR="0" wp14:anchorId="67059FEB" wp14:editId="65CA184B">
             <wp:extent cx="5943600" cy="5430520"/>
             <wp:effectExtent l="0" t="0" r="0" b="5080"/>
             <wp:docPr id="1262093754" name="Picture 3"/>
@@ -1703,7 +1728,7 @@
         </w:rPr>
         <w:lastRenderedPageBreak/>
         <w:drawing>
-          <wp:inline distT="0" distB="0" distL="0" distR="0" wp14:anchorId="3A141C1F" wp14:editId="75ED8471">
+          <wp:inline distT="0" distB="0" distL="0" distR="0" wp14:anchorId="3A141C1F" wp14:editId="7D7AA99E">
             <wp:extent cx="5943600" cy="5349240"/>
             <wp:effectExtent l="0" t="0" r="0" b="0"/>
             <wp:docPr id="1774673356" name="Picture 2"/>
@@ -1753,7 +1778,7 @@
         </w:rPr>
         <w:lastRenderedPageBreak/>
         <w:drawing>
-          <wp:inline distT="0" distB="0" distL="0" distR="0" wp14:anchorId="19B652B0" wp14:editId="2DA033BC">
+          <wp:inline distT="0" distB="0" distL="0" distR="0" wp14:anchorId="19B652B0" wp14:editId="5F8E9F1B">
             <wp:extent cx="5943600" cy="5029200"/>
             <wp:effectExtent l="0" t="0" r="0" b="0"/>
             <wp:docPr id="1963444869" name="Picture 1"/>
@@ -2054,7 +2079,6 @@
       <w:pPr>
         <w:spacing w:after="80" w:line="240" w:lineRule="auto"/>
         <w:rPr>
-          <w:rFonts w:hint="eastAsia"/>
           <w:sz w:val="22"/>
           <w:szCs w:val="22"/>
         </w:rPr>
@@ -2130,7 +2154,6 @@
     <w:p>
       <w:pPr>
         <w:rPr>
-          <w:rFonts w:hint="eastAsia"/>
           <w:b/>
           <w:bCs/>
         </w:rPr>
@@ -2155,7 +2178,7 @@
           <w:szCs w:val="36"/>
         </w:rPr>
         <w:drawing>
-          <wp:inline distT="0" distB="0" distL="0" distR="0" wp14:anchorId="152C1406" wp14:editId="46BF22A0">
+          <wp:inline distT="0" distB="0" distL="0" distR="0" wp14:anchorId="152C1406" wp14:editId="463E4FF7">
             <wp:extent cx="5943600" cy="3343275"/>
             <wp:effectExtent l="0" t="0" r="0" b="0"/>
             <wp:docPr id="1288899948" name="Picture 7"/>
@@ -2840,7 +2863,6 @@
       <w:pPr>
         <w:spacing w:after="80" w:line="240" w:lineRule="auto"/>
         <w:rPr>
-          <w:rFonts w:hint="eastAsia"/>
           <w:sz w:val="22"/>
           <w:szCs w:val="22"/>
         </w:rPr>
@@ -2886,7 +2908,6 @@
     <w:p>
       <w:pPr>
         <w:rPr>
-          <w:rFonts w:hint="eastAsia"/>
           <w:b/>
           <w:bCs/>
         </w:rPr>
@@ -2973,7 +2994,7 @@
         </w:rPr>
         <w:lastRenderedPageBreak/>
         <w:drawing>
-          <wp:inline distT="0" distB="0" distL="0" distR="0" wp14:anchorId="37BF77FF" wp14:editId="6A973AFE">
+          <wp:inline distT="0" distB="0" distL="0" distR="0" wp14:anchorId="37BF77FF" wp14:editId="5A13D77A">
             <wp:extent cx="5943600" cy="5352415"/>
             <wp:effectExtent l="0" t="0" r="0" b="0"/>
             <wp:docPr id="367483101" name="Picture 11"/>
@@ -3019,7 +3040,6 @@
       <w:pPr>
         <w:spacing w:after="0"/>
         <w:rPr>
-          <w:rFonts w:hint="eastAsia"/>
           <w:sz w:val="22"/>
           <w:szCs w:val="22"/>
         </w:rPr>

</xml_diff>